<commit_message>
feat: completar integracion y documentacion del monitoreo
Co-authored-by: Copilot <223556219+Copilot@users.noreply.github.com>
</commit_message>
<xml_diff>
--- a/src/database/Base_de_datos_y_pruebas_de_carga.docx
+++ b/src/database/Base_de_datos_y_pruebas_de_carga.docx
@@ -13,7 +13,7 @@
     <w:p>
       <w:pPr/>
       <w:r>
-        <w:t xml:space="preserve">Elaboró: Sebastián Gutiérrez Ponce (Dev Team – Base de Datos) · Equipo 2 · Programación Concurrente, UVM Campus San Rafael · 07/10/2026</w:t>
+        <w:t>Elaboró: Gutiérrez Ponce Sebastián (Dev Team – Base de Datos) · Equipo 2 · Programación Concurrente, UVM Campus San Rafael · Documento iniciado el 07/10/2026; actualización 22/10/2026.</w:t>
       </w:r>
     </w:p>
     <w:p>
@@ -93,50 +93,44 @@
         </w:numPr>
       </w:pPr>
       <w:r>
-        <w:t xml:space="preserve">Se ejecutó la prueba de carga con 20 hilos concurrentes: 0 errores inesperados y 0 corrupción de datos.</w:t>
-      </w:r>
-    </w:p>
-    <w:p>
-      <w:pPr/>
-      <w:r>
-        <w:t xml:space="preserve">Los archivos que se entregan al equipo son </w:t>
+        <w:t>La ejecución MySQL más reciente (14/10/2026), con 20 hilos/sensores × 500 intentos (10 000 intentos), registró 9 500 lecturas, 2 627 alertas, 500 duplicados esperados, cero reintentos por deadlock y cero errores inesperados. La verificación encontró cero alertas huérfanas; el detalle está en docs/informe_pruebas.md.</w:t>
+      </w:r>
+    </w:p>
+    <w:p>
+      <w:pPr/>
+      <w:r>
+        <w:t>Estado de la instancia local al 15/10/2026: después de conservar la evidencia de carga, se eliminaron 15 040 alertas y 32 344 lecturas; ambas tablas quedaron en cero. Se conservaron tablas, sensores y umbrales. La API mostrará el historial vacío hasta que vuelvan a ejecutarse productores. Para el procedimiento opcional y seguro de limpieza, consulta docs/manual_usuario.md o src/database/README.md.</w:t>
+      </w:r>
+    </w:p>
+    <w:p>
+      <w:pPr/>
+      <w:r>
+        <w:t>Los archivos principales son schema.sql, datos_prueba.sql y carga_concurrente.py. Para una base existente, actualizar_umbrales_verificados.sql es una actualización opcional que requiere ejecución explícita; quien empieza desde cero puede crear el esquema con schema.sql.</w:t>
       </w:r>
       <w:r>
         <w:rPr>
           <w:rStyle w:val="CodeChar"/>
         </w:rPr>
-        <w:t xml:space="preserve">schema.sql</w:t>
-      </w:r>
-      <w:r>
-        <w:t xml:space="preserve">, </w:t>
-      </w:r>
+      </w:r>
+      <w:r/>
       <w:r>
         <w:rPr>
           <w:rStyle w:val="CodeChar"/>
         </w:rPr>
-        <w:t xml:space="preserve">datos_prueba.sql</w:t>
-      </w:r>
-      <w:r>
-        <w:t xml:space="preserve"> y </w:t>
-      </w:r>
+      </w:r>
+      <w:r/>
       <w:r>
         <w:rPr>
           <w:rStyle w:val="CodeChar"/>
         </w:rPr>
-        <w:t xml:space="preserve">carga_concurrente.py</w:t>
-      </w:r>
-      <w:r>
-        <w:t xml:space="preserve">. El archivo </w:t>
-      </w:r>
+      </w:r>
+      <w:r/>
       <w:r>
         <w:rPr>
           <w:rStyle w:val="CodeChar"/>
         </w:rPr>
-        <w:t xml:space="preserve">migracion_umbrales.sql</w:t>
-      </w:r>
-      <w:r>
-        <w:t xml:space="preserve"> es opcional: solo sirve para actualizar una base creada con una versión anterior del esquema, y quien empiece desde cero no lo necesita.</w:t>
-      </w:r>
+      </w:r>
+      <w:r/>
     </w:p>
     <w:p>
       <w:pPr>
@@ -155,7 +149,11 @@
     <w:p>
       <w:pPr/>
       <w:r>
-        <w:t xml:space="preserve">Sensores → Hilos productores (MQTT) → Cola concurrente → Pool de hilos consumidores → DatabaseManager → MySQL ← FastAPI ← Dashboard</w:t>
+        <w:t>Ruta C++: simulador ? hilos productores ? cola concurrente ? pool de consumidores ? DatabaseManager ? MySQL.</w:t>
+        <w:br/>
+        <w:t>Ruta MQTT: simulador/publicador ? broker Mosquitto ? ingestor MQTT de FastAPI ? MySQL.</w:t>
+        <w:br/>
+        <w:t>Consulta: MySQL ? FastAPI (REST/WebSocket) ? dashboard.</w:t>
       </w:r>
     </w:p>
     <w:p>
@@ -197,7 +195,7 @@
     <w:p>
       <w:pPr/>
       <w:r>
-        <w:t xml:space="preserve">Importante: la página web nunca se conecta directamente a MySQL. El navegador habla con FastAPI, y FastAPI habla con MySQL. Así las credenciales de la base nunca quedan expuestas al usuario.</w:t>
+        <w:t>Importante: la página web nunca se conecta directamente a MySQL. El navegador habla con FastAPI, y FastAPI habla con MySQL. Así las credenciales de la base nunca quedan expuestas al usuario. Docker Compose ejecuta solo Mosquitto para la ruta MQTT; MySQL es un servicio separado y conserva sus datos aunque el broker se detenga. La ruta C++ directa a MySQL no necesita Docker. WebSocket mantiene un canal abierto entre FastAPI y el navegador para enviar snapshots JSON del estado y las alertas que FastAPI obtiene de MySQL, aproximadamente cada 2 s. WebSocket no es la base de datos ni guarda lecturas; REST carga el estado inicial y el historial y sirve temporalmente si el canal se reconecta.</w:t>
       </w:r>
     </w:p>
     <w:p>
@@ -902,9 +900,8 @@
             <w:tcW w:w="1350" w:type="dxa"/>
           </w:tcPr>
           <w:p>
-            <w:pPr/>
-            <w:r>
-              <w:t xml:space="preserve">41 µg/m³</w:t>
+            <w:r>
+              <w:t>25 µg/m³</w:t>
             </w:r>
           </w:p>
         </w:tc>
@@ -913,9 +910,8 @@
             <w:tcW w:w="3660" w:type="dxa"/>
           </w:tcPr>
           <w:p>
-            <w:pPr/>
-            <w:r>
-              <w:t xml:space="preserve">NOM-025-SSA1-2021 (verificar valor final en el DOF)</w:t>
+            <w:r>
+              <w:t>NOM-025-SSA1-2021, Tabla 1 (fase Año 5; promedio 24 h)</w:t>
             </w:r>
           </w:p>
         </w:tc>
@@ -1298,7 +1294,7 @@
         </w:numPr>
       </w:pPr>
       <w:r>
-        <w:t xml:space="preserve">PM2.5 (NOM-025-SSA1-2021, Secretaría de Salud): se publicó en el DOF el 27/10/2021 y sustituyó a la versión de 2014, que permitía 45 µg/m³ en 24 horas. Se aplica de forma gradual durante 5 años a partir del 27 de octubre de 2022. Los reportes de monitoreo del Estado de México citan 41 µg/m³ como límite de 24 horas. Falta verificar en el DOF el valor final al terminar la transición.</w:t>
+        <w:t>PM2.5 (NOM-025-SSA1-2021, Secretaría de Salud): la Tabla 1 establece valores graduales de 41, 33 y 25 µg/m³ para el promedio de 24 horas (Año 1, Año 3 y Año 5). Para el estado del proyecto al 14/10/2026 se usa la fase Año 5: 25 µg/m³. Los niveles instantáneos 35/75 µg/m³ son criterios provisionales del prototipo, no límites instantáneos definidos por esta NOM. Fuente oficial: DOF, NOM-025-SSA1-2021.</w:t>
       </w:r>
     </w:p>
     <w:p>
@@ -1504,7 +1500,7 @@
     <w:p>
       <w:pPr/>
       <w:r>
-        <w:t xml:space="preserve">Decisión pendiente para el equipo: ¿se descarta el duplicado (política actual), se ignora con INSERT IGNORE o se actualiza la fila existente? Hay que ponerse de acuerdo antes de implementar el DatabaseManager.</w:t>
+        <w:t>Política implementada: se rechaza el duplicado con el error MySQL 1062 por la restricción UNIQUE sensor/timestamp. El núcleo C++ y la prueba de carga tratan ese resultado como duplicado esperado; no se usa INSERT IGNORE ni se actualiza la lectura existente.</w:t>
       </w:r>
     </w:p>
     <w:p>
@@ -1705,212 +1701,194 @@
             <w:tcW w:w="4680" w:type="dxa"/>
           </w:tcPr>
           <w:p>
-            <w:pPr/>
-            <w:r>
-              <w:t xml:space="preserve">Intentos totales (20 × 300)</w:t>
-            </w:r>
-          </w:p>
-        </w:tc>
-        <w:tc>
-          <w:tcPr>
-            <w:tcW w:w="4680" w:type="dxa"/>
-          </w:tcPr>
-          <w:p>
-            <w:pPr/>
-            <w:r>
-              <w:t xml:space="preserve">6,000</w:t>
-            </w:r>
-          </w:p>
-        </w:tc>
-      </w:tr>
-      <w:tr>
-        <w:tc>
-          <w:tcPr>
-            <w:tcW w:w="4680" w:type="dxa"/>
-          </w:tcPr>
-          <w:p>
-            <w:pPr/>
-            <w:r>
-              <w:t xml:space="preserve">Lecturas guardadas</w:t>
-            </w:r>
-          </w:p>
-        </w:tc>
-        <w:tc>
-          <w:tcPr>
-            <w:tcW w:w="4680" w:type="dxa"/>
-          </w:tcPr>
-          <w:p>
-            <w:pPr/>
-            <w:r>
-              <w:t xml:space="preserve">5,403</w:t>
-            </w:r>
-          </w:p>
-        </w:tc>
-      </w:tr>
-      <w:tr>
-        <w:tc>
-          <w:tcPr>
-            <w:tcW w:w="4680" w:type="dxa"/>
-          </w:tcPr>
-          <w:p>
-            <w:pPr/>
-            <w:r>
-              <w:t xml:space="preserve">Duplicados rechazados (error 1062)</w:t>
-            </w:r>
-          </w:p>
-        </w:tc>
-        <w:tc>
-          <w:tcPr>
-            <w:tcW w:w="4680" w:type="dxa"/>
-          </w:tcPr>
-          <w:p>
-            <w:pPr/>
-            <w:r>
-              <w:t xml:space="preserve">597</w:t>
-            </w:r>
-          </w:p>
-        </w:tc>
-      </w:tr>
-      <w:tr>
-        <w:tc>
-          <w:tcPr>
-            <w:tcW w:w="4680" w:type="dxa"/>
-          </w:tcPr>
-          <w:p>
-            <w:pPr/>
-            <w:r>
-              <w:t xml:space="preserve">Alertas generadas</w:t>
-            </w:r>
-          </w:p>
-        </w:tc>
-        <w:tc>
-          <w:tcPr>
-            <w:tcW w:w="4680" w:type="dxa"/>
-          </w:tcPr>
-          <w:p>
-            <w:pPr/>
-            <w:r>
-              <w:t xml:space="preserve">1,509</w:t>
-            </w:r>
-          </w:p>
-        </w:tc>
-      </w:tr>
-      <w:tr>
-        <w:tc>
-          <w:tcPr>
-            <w:tcW w:w="4680" w:type="dxa"/>
-          </w:tcPr>
-          <w:p>
-            <w:pPr/>
-            <w:r>
-              <w:t xml:space="preserve">Reintentos por deadlock</w:t>
-            </w:r>
-          </w:p>
-        </w:tc>
-        <w:tc>
-          <w:tcPr>
-            <w:tcW w:w="4680" w:type="dxa"/>
-          </w:tcPr>
-          <w:p>
-            <w:pPr/>
-            <w:r>
-              <w:t xml:space="preserve">0</w:t>
-            </w:r>
-          </w:p>
-        </w:tc>
-      </w:tr>
-      <w:tr>
-        <w:tc>
-          <w:tcPr>
-            <w:tcW w:w="4680" w:type="dxa"/>
-          </w:tcPr>
-          <w:p>
-            <w:pPr/>
-            <w:r>
-              <w:t xml:space="preserve">Errores inesperados</w:t>
-            </w:r>
-          </w:p>
-        </w:tc>
-        <w:tc>
-          <w:tcPr>
-            <w:tcW w:w="4680" w:type="dxa"/>
-          </w:tcPr>
-          <w:p>
-            <w:pPr/>
-            <w:r>
-              <w:t xml:space="preserve">0</w:t>
-            </w:r>
-          </w:p>
-        </w:tc>
-      </w:tr>
-      <w:tr>
-        <w:tc>
-          <w:tcPr>
-            <w:tcW w:w="4680" w:type="dxa"/>
-          </w:tcPr>
-          <w:p>
-            <w:pPr/>
-            <w:r>
-              <w:t xml:space="preserve">Tiempo total</w:t>
-            </w:r>
-          </w:p>
-        </w:tc>
-        <w:tc>
-          <w:tcPr>
-            <w:tcW w:w="4680" w:type="dxa"/>
-          </w:tcPr>
-          <w:p>
-            <w:pPr/>
-            <w:r>
-              <w:t xml:space="preserve">4.81 s</w:t>
-            </w:r>
-          </w:p>
-        </w:tc>
-      </w:tr>
-      <w:tr>
-        <w:tc>
-          <w:tcPr>
-            <w:tcW w:w="4680" w:type="dxa"/>
-          </w:tcPr>
-          <w:p>
-            <w:pPr/>
-            <w:r>
-              <w:t xml:space="preserve">Rendimiento</w:t>
-            </w:r>
-          </w:p>
-        </w:tc>
-        <w:tc>
-          <w:tcPr>
-            <w:tcW w:w="4680" w:type="dxa"/>
-          </w:tcPr>
-          <w:p>
-            <w:pPr/>
-            <w:r>
-              <w:t xml:space="preserve">1,124 lecturas/s</w:t>
-            </w:r>
-          </w:p>
-        </w:tc>
-      </w:tr>
-      <w:tr>
-        <w:tc>
-          <w:tcPr>
-            <w:tcW w:w="4680" w:type="dxa"/>
-          </w:tcPr>
-          <w:p>
-            <w:pPr/>
-            <w:r>
-              <w:t xml:space="preserve">Alertas sin lectura (huérfanas)</w:t>
-            </w:r>
-          </w:p>
-        </w:tc>
-        <w:tc>
-          <w:tcPr>
-            <w:tcW w:w="4680" w:type="dxa"/>
-          </w:tcPr>
-          <w:p>
-            <w:pPr/>
-            <w:r>
-              <w:t xml:space="preserve">0</w:t>
+            <w:r>
+              <w:t>Intentos totales (20 × 500)</w:t>
+            </w:r>
+          </w:p>
+        </w:tc>
+        <w:tc>
+          <w:tcPr>
+            <w:tcW w:w="4680" w:type="dxa"/>
+          </w:tcPr>
+          <w:p>
+            <w:r>
+              <w:t>10 000</w:t>
+            </w:r>
+          </w:p>
+        </w:tc>
+      </w:tr>
+      <w:tr>
+        <w:tc>
+          <w:tcPr>
+            <w:tcW w:w="4680" w:type="dxa"/>
+          </w:tcPr>
+          <w:p>
+            <w:r>
+              <w:t>Lecturas guardadas</w:t>
+            </w:r>
+          </w:p>
+        </w:tc>
+        <w:tc>
+          <w:tcPr>
+            <w:tcW w:w="4680" w:type="dxa"/>
+          </w:tcPr>
+          <w:p>
+            <w:r>
+              <w:t>9 500</w:t>
+            </w:r>
+          </w:p>
+        </w:tc>
+      </w:tr>
+      <w:tr>
+        <w:tc>
+          <w:tcPr>
+            <w:tcW w:w="4680" w:type="dxa"/>
+          </w:tcPr>
+          <w:p>
+            <w:r>
+              <w:t>Duplicados rechazados (error 1062)</w:t>
+            </w:r>
+          </w:p>
+        </w:tc>
+        <w:tc>
+          <w:tcPr>
+            <w:tcW w:w="4680" w:type="dxa"/>
+          </w:tcPr>
+          <w:p>
+            <w:r>
+              <w:t>500</w:t>
+            </w:r>
+          </w:p>
+        </w:tc>
+      </w:tr>
+      <w:tr>
+        <w:tc>
+          <w:tcPr>
+            <w:tcW w:w="4680" w:type="dxa"/>
+          </w:tcPr>
+          <w:p>
+            <w:r>
+              <w:t>Alertas generadas</w:t>
+            </w:r>
+          </w:p>
+        </w:tc>
+        <w:tc>
+          <w:tcPr>
+            <w:tcW w:w="4680" w:type="dxa"/>
+          </w:tcPr>
+          <w:p>
+            <w:r>
+              <w:t>2 627</w:t>
+            </w:r>
+          </w:p>
+        </w:tc>
+      </w:tr>
+      <w:tr>
+        <w:tc>
+          <w:tcPr>
+            <w:tcW w:w="4680" w:type="dxa"/>
+          </w:tcPr>
+          <w:p>
+            <w:r>
+              <w:t>Reintentos por deadlock</w:t>
+            </w:r>
+          </w:p>
+        </w:tc>
+        <w:tc>
+          <w:tcPr>
+            <w:tcW w:w="4680" w:type="dxa"/>
+          </w:tcPr>
+          <w:p>
+            <w:r>
+              <w:t>0</w:t>
+            </w:r>
+          </w:p>
+        </w:tc>
+      </w:tr>
+      <w:tr>
+        <w:tc>
+          <w:tcPr>
+            <w:tcW w:w="4680" w:type="dxa"/>
+          </w:tcPr>
+          <w:p>
+            <w:r>
+              <w:t>Errores inesperados</w:t>
+            </w:r>
+          </w:p>
+        </w:tc>
+        <w:tc>
+          <w:tcPr>
+            <w:tcW w:w="4680" w:type="dxa"/>
+          </w:tcPr>
+          <w:p>
+            <w:r>
+              <w:t>0</w:t>
+            </w:r>
+          </w:p>
+        </w:tc>
+      </w:tr>
+      <w:tr>
+        <w:tc>
+          <w:tcPr>
+            <w:tcW w:w="4680" w:type="dxa"/>
+          </w:tcPr>
+          <w:p>
+            <w:r>
+              <w:t>Tiempo total</w:t>
+            </w:r>
+          </w:p>
+        </w:tc>
+        <w:tc>
+          <w:tcPr>
+            <w:tcW w:w="4680" w:type="dxa"/>
+          </w:tcPr>
+          <w:p>
+            <w:r>
+              <w:t>7.09 s</w:t>
+            </w:r>
+          </w:p>
+        </w:tc>
+      </w:tr>
+      <w:tr>
+        <w:tc>
+          <w:tcPr>
+            <w:tcW w:w="4680" w:type="dxa"/>
+          </w:tcPr>
+          <w:p>
+            <w:r>
+              <w:t>Rendimiento</w:t>
+            </w:r>
+          </w:p>
+        </w:tc>
+        <w:tc>
+          <w:tcPr>
+            <w:tcW w:w="4680" w:type="dxa"/>
+          </w:tcPr>
+          <w:p>
+            <w:r>
+              <w:t>1 340 lecturas/s</w:t>
+            </w:r>
+          </w:p>
+        </w:tc>
+      </w:tr>
+      <w:tr>
+        <w:tc>
+          <w:tcPr>
+            <w:tcW w:w="4680" w:type="dxa"/>
+          </w:tcPr>
+          <w:p>
+            <w:r>
+              <w:t>Alertas sin lectura (huérfanas)</w:t>
+            </w:r>
+          </w:p>
+        </w:tc>
+        <w:tc>
+          <w:tcPr>
+            <w:tcW w:w="4680" w:type="dxa"/>
+          </w:tcPr>
+          <w:p>
+            <w:r>
+              <w:t>0</w:t>
             </w:r>
           </w:p>
         </w:tc>
@@ -1919,7 +1897,7 @@
     <w:p>
       <w:pPr/>
       <w:r>
-        <w:t xml:space="preserve">Cómo interpretarlo: 5,403 guardadas más 597 rechazadas dan exactamente los 6,000 intentos, así que ninguna lectura se perdió ni se guardó dos veces. Las alertas en la base coinciden con las que generaron los hilos y ninguna quedó sin su lectura. El rendimiento depende de la computadora, por lo que no es comparable entre equipos.</w:t>
+        <w:t>Cómo interpretar la ejecución más reciente: 9 500 lecturas guardadas más 500 duplicados rechazados suman los 10 000 intentos. Las 2 627 alertas coinciden con la prueba y no hay alertas huérfanas. El rendimiento depende de la computadora y no es comparable entre equipos.</w:t>
       </w:r>
     </w:p>
     <w:p>
@@ -2003,7 +1981,7 @@
         </w:numPr>
       </w:pPr>
       <w:r>
-        <w:t xml:space="preserve">Instalar MySQL Server 8 y MySQL Workbench.</w:t>
+        <w:t>Instala MySQL Server 8; MySQL Workbench es opcional. Para instalar y preparar la base sin Workbench, sigue docs/manual_usuario.md.</w:t>
       </w:r>
     </w:p>
     <w:p>
@@ -2015,7 +1993,7 @@
         </w:numPr>
       </w:pPr>
       <w:r>
-        <w:t xml:space="preserve">En Workbench, abrir schema.sql (File &gt; Open SQL Script) y ejecutarlo completo con el rayo.</w:t>
+        <w:t>Ejecuta schema.sql desde MySQL Workbench o con el cliente mysql. Los pasos para ambas alternativas están en docs/manual_usuario.md.</w:t>
       </w:r>
     </w:p>
     <w:p>
@@ -2039,7 +2017,7 @@
         </w:numPr>
       </w:pPr>
       <w:r>
-        <w:t xml:space="preserve">Si la base ya existía de una versión anterior, ejecutar migracion_umbrales.sql, que recrea solo la tabla umbrales.</w:t>
+        <w:t>Si la base ya existe, revisa actualizar_umbrales_verificados.sql y ejecútalo solo si quieres aplicar explícitamente los valores verificados. No elimina lecturas ni alertas.</w:t>
       </w:r>
     </w:p>
     <w:p>
@@ -2199,7 +2177,7 @@
         <w:pStyle w:val="Heading2"/>
       </w:pPr>
       <w:r>
-        <w:t xml:space="preserve">10. Pendientes y decisiones abiertas</w:t>
+        <w:t>10. Estado y decisiones vigentes al 15/10/2026</w:t>
       </w:r>
     </w:p>
     <w:p>
@@ -2211,7 +2189,7 @@
         </w:numPr>
       </w:pPr>
       <w:r>
-        <w:t xml:space="preserve">Revisión del esquema por Delgadillo Escartín Eduardo Abraham (compañero del equipo de base de datos).</w:t>
+        <w:t>El esquema y su integridad se revisaron con las pruebas de carga; no se reportaron alertas huérfanas ni errores inesperados.</w:t>
       </w:r>
     </w:p>
     <w:p>
@@ -2223,7 +2201,7 @@
         </w:numPr>
       </w:pPr>
       <w:r>
-        <w:t xml:space="preserve">Verificar en el texto oficial del DOF el valor final de PM2.5 de la NOM-025-SSA1-2021 y los valores de CO₂ de la Tabla I.1 de la NOM-010-STPS-2014.</w:t>
+        <w:t>Las referencias normativas de PM2.5, CO₂ y temperatura se documentan con sus alcances y limitaciones en docs/informe_pruebas.md y src/database/README.md.</w:t>
       </w:r>
     </w:p>
     <w:p>
@@ -2235,7 +2213,7 @@
         </w:numPr>
       </w:pPr>
       <w:r>
-        <w:t xml:space="preserve">Definir cómo se calculan los promedios móviles de 8 y de 24 horas (con el equipo del núcleo concurrente).</w:t>
+        <w:t>La API calcula los promedios móviles de PM2.5 (24 h) y CO₂ (8 h); el esquema de alertas actual registra superaciones puntuales, no alertas por esos promedios.</w:t>
       </w:r>
     </w:p>
     <w:p>
@@ -2247,7 +2225,7 @@
         </w:numPr>
       </w:pPr>
       <w:r>
-        <w:t xml:space="preserve">Definir la política para lecturas duplicadas: descartar, INSERT IGNORE o actualizar.</w:t>
+        <w:t>La política para duplicados está definida e implementada: rechazar con MySQL 1062, sin insertar ni actualizar una fila existente.</w:t>
       </w:r>
     </w:p>
     <w:p>
@@ -2259,7 +2237,7 @@
         </w:numPr>
       </w:pPr>
       <w:r>
-        <w:t xml:space="preserve">Subir los archivos al repositorio de GitHub (carpeta database/) cuando se otorgue el acceso.</w:t>
+        <w:t>La ejecución y los conteos descritos en este documento corresponden a la instancia local de demostración; cada instalación del equipo conserva su propia base e historial.</w:t>
       </w:r>
     </w:p>
     <w:p>
@@ -2271,7 +2249,7 @@
         </w:numPr>
       </w:pPr>
       <w:r>
-        <w:t xml:space="preserve">Decidir cómo se desplegará la base para que todo el equipo use la misma: Docker Compose, una computadora del equipo o la nube.</w:t>
+        <w:t>El prototipo documenta y valida MySQL local; no configura una base compartida en nube ni un servicio de producción.</w:t>
       </w:r>
     </w:p>
     <w:p>

</xml_diff>